<commit_message>
Update Task Info WBS-27; Update Task Info WBS-28
</commit_message>
<xml_diff>
--- a/Documentation/Analysis/Task Informations/Open/Team/Task Info WBS-27 - W.docx
+++ b/Documentation/Analysis/Task Informations/Open/Team/Task Info WBS-27 - W.docx
@@ -1019,7 +1019,10 @@
           </w:tcPr>
           <w:p>
             <w:r>
-              <w:t>45 min until now</w:t>
+              <w:t>60</w:t>
+            </w:r>
+            <w:r>
+              <w:t xml:space="preserve"> min until now</w:t>
             </w:r>
           </w:p>
         </w:tc>
@@ -2039,7 +2042,7 @@
   <w:num w:numId="3" w16cid:durableId="835001896">
     <w:abstractNumId w:val="0"/>
     <w:lvlOverride w:ilvl="0">
-      <w:lvl w:ilvl="0" w:tplc="E7C4E958">
+      <w:lvl w:ilvl="0" w:tplc="6E7C0C72">
         <w:start w:val="1"/>
         <w:numFmt w:val="bullet"/>
         <w:lvlText w:val="·"/>
@@ -2071,7 +2074,7 @@
       </w:lvl>
     </w:lvlOverride>
     <w:lvlOverride w:ilvl="1">
-      <w:lvl w:ilvl="1" w:tplc="7C5C497A">
+      <w:lvl w:ilvl="1" w:tplc="F110976A">
         <w:start w:val="1"/>
         <w:numFmt w:val="bullet"/>
         <w:lvlText w:val="o"/>
@@ -2103,7 +2106,7 @@
       </w:lvl>
     </w:lvlOverride>
     <w:lvlOverride w:ilvl="2">
-      <w:lvl w:ilvl="2" w:tplc="41AA8BC0">
+      <w:lvl w:ilvl="2" w:tplc="5BB8318E">
         <w:start w:val="1"/>
         <w:numFmt w:val="bullet"/>
         <w:lvlText w:val="▪"/>
@@ -2135,7 +2138,7 @@
       </w:lvl>
     </w:lvlOverride>
     <w:lvlOverride w:ilvl="3">
-      <w:lvl w:ilvl="3" w:tplc="A67428F6">
+      <w:lvl w:ilvl="3" w:tplc="6FC66D96">
         <w:start w:val="1"/>
         <w:numFmt w:val="bullet"/>
         <w:lvlText w:val="·"/>
@@ -2167,7 +2170,7 @@
       </w:lvl>
     </w:lvlOverride>
     <w:lvlOverride w:ilvl="4">
-      <w:lvl w:ilvl="4" w:tplc="BE88EFE6">
+      <w:lvl w:ilvl="4" w:tplc="AC9E9B58">
         <w:start w:val="1"/>
         <w:numFmt w:val="bullet"/>
         <w:lvlText w:val="o"/>
@@ -2199,7 +2202,7 @@
       </w:lvl>
     </w:lvlOverride>
     <w:lvlOverride w:ilvl="5">
-      <w:lvl w:ilvl="5" w:tplc="E98C683A">
+      <w:lvl w:ilvl="5" w:tplc="16F40AB0">
         <w:start w:val="1"/>
         <w:numFmt w:val="bullet"/>
         <w:lvlText w:val="▪"/>
@@ -2231,7 +2234,7 @@
       </w:lvl>
     </w:lvlOverride>
     <w:lvlOverride w:ilvl="6">
-      <w:lvl w:ilvl="6" w:tplc="E78CA306">
+      <w:lvl w:ilvl="6" w:tplc="74F426B2">
         <w:start w:val="1"/>
         <w:numFmt w:val="bullet"/>
         <w:lvlText w:val="·"/>
@@ -2263,7 +2266,7 @@
       </w:lvl>
     </w:lvlOverride>
     <w:lvlOverride w:ilvl="7">
-      <w:lvl w:ilvl="7" w:tplc="90102E34">
+      <w:lvl w:ilvl="7" w:tplc="BE788F42">
         <w:start w:val="1"/>
         <w:numFmt w:val="bullet"/>
         <w:lvlText w:val="o"/>
@@ -2295,7 +2298,7 @@
       </w:lvl>
     </w:lvlOverride>
     <w:lvlOverride w:ilvl="8">
-      <w:lvl w:ilvl="8" w:tplc="D3FE3B40">
+      <w:lvl w:ilvl="8" w:tplc="7FF0990C">
         <w:start w:val="1"/>
         <w:numFmt w:val="bullet"/>
         <w:lvlText w:val="▪"/>

</xml_diff>